<commit_message>
chore: rebrand project from ZK-LMS to EduAI
Rename every reference across code, config, env, docs and Office
documents: ZK-LMS -> EduAI (brand), zk-lms -> edu-ai (slugs/urls),
zklms -> eduai (identifiers, DB name, storage keys, container names).

Co-Authored-By: Claude Opus 4.8 (1M context) <noreply@anthropic.com>
</commit_message>
<xml_diff>
--- a/docs/relacion_tema2_LMS_FINAL.docx
+++ b/docs/relacion_tema2_LMS_FINAL.docx
@@ -1368,7 +1368,7 @@
           <w:rFonts w:ascii="Times New Roman" w:hAnsi="Times New Roman"/>
           <w:sz w:val="24"/>
         </w:rPr>
-        <w:t xml:space="preserve">Baza e te dhenave e sistemit ZK-LMS eshte modeluar si nje skeme relacionale ne PostgreSQL, e aksesuar nepermjet Prisma ORM. Te gjitha relacionet ndermjet entiteteve jane te tipizuara ne menyre strikte me TypeScript, duke garantuar integrite referencial dhe type-safety ne te gjithe stack-un. Me poshte paraqitet Prisma Schema i plote me te gjitha entitetet dhe relacionet e tyre.</w:t>
+        <w:t xml:space="preserve">Baza e te dhenave e sistemit EduAI eshte modeluar si nje skeme relacionale ne PostgreSQL, e aksesuar nepermjet Prisma ORM. Te gjitha relacionet ndermjet entiteteve jane te tipizuara ne menyre strikte me TypeScript, duke garantuar integrite referencial dhe type-safety ne te gjithe stack-un. Me poshte paraqitet Prisma Schema i plote me te gjitha entitetet dhe relacionet e tyre.</w:t>
       </w:r>
     </w:p>
     <w:p>
@@ -1568,7 +1568,7 @@
           <w:rFonts w:ascii="Times New Roman" w:hAnsi="Times New Roman"/>
           <w:sz w:val="24"/>
         </w:rPr>
-        <w:t xml:space="preserve">Sistemi ZK-LMS operon mbi nje hierarki te qarte aksesi dhe te dhenash me tre nivele: Admin, Instruktor dhe Student. Informacioni nuk kalon ne menyre kaotike mes ketyre niveleve — ka rruge te percaktuara, te kontrolluar nga middleware-i RBAC (Role-Based Access Control) ne backend dhe nga layout-et e ndara te Next.js ne frontend. Me poshte pershkruhet ne detaje si funksionon cdo lidhje.</w:t>
+        <w:t xml:space="preserve">Sistemi EduAI operon mbi nje hierarki te qarte aksesi dhe te dhenash me tre nivele: Admin, Instruktor dhe Student. Informacioni nuk kalon ne menyre kaotike mes ketyre niveleve — ka rruge te percaktuara, te kontrolluar nga middleware-i RBAC (Role-Based Access Control) ne backend dhe nga layout-et e ndara te Next.js ne frontend. Me poshte pershkruhet ne detaje si funksionon cdo lidhje.</w:t>
       </w:r>
     </w:p>
     <w:p>
@@ -1734,7 +1734,7 @@
           <w:rFonts w:ascii="Times New Roman" w:hAnsi="Times New Roman"/>
           <w:sz w:val="24"/>
         </w:rPr>
-        <w:t xml:space="preserve">Cdo rol perdoruesi ne ZK-LMS ka nje nderfaqe dhe nje set funksionalitetesh te dedikuara. Nderfaqja ndahet nepermjet layout-eve te ndara ne Next.js: /admin/**, /instructor/**, /student/** — me routing te mbrojtur nga middleware-i i autentikimit. Me poshte detajohen funksionalitetet dhe dashboardet per secilin rol.</w:t>
+        <w:t xml:space="preserve">Cdo rol perdoruesi ne EduAI ka nje nderfaqe dhe nje set funksionalitetesh te dedikuara. Nderfaqja ndahet nepermjet layout-eve te ndara ne Next.js: /admin/**, /instructor/**, /student/** — me routing te mbrojtur nga middleware-i i autentikimit. Me poshte detajohen funksionalitetet dhe dashboardet per secilin rol.</w:t>
       </w:r>
     </w:p>
     <w:p>

</xml_diff>